<commit_message>
Deployed 298fa182 with MkDocs version: 1.6.1
</commit_message>
<xml_diff>
--- a/download/service_providing_group.docx
+++ b/download/service_providing_group.docx
@@ -280,10 +280,10 @@
         <w:tblLook w:firstRow="1" w:lastRow="0" w:firstColumn="0" w:lastColumn="0" w:noHBand="0" w:noVBand="0" w:val="0020"/>
       </w:tblPr>
       <w:tblGrid>
-        <w:gridCol w:w="1628"/>
-        <w:gridCol w:w="2194"/>
-        <w:gridCol w:w="3565"/>
-        <w:gridCol w:w="531"/>
+        <w:gridCol w:w="1748"/>
+        <w:gridCol w:w="2152"/>
+        <w:gridCol w:w="3497"/>
+        <w:gridCol w:w="521"/>
       </w:tblGrid>
       <w:tr>
         <w:trPr>
@@ -737,6 +737,49 @@
             </w:r>
             <w:r>
               <w:t xml:space="preserve">, only editable by a FIS operator.</w:t>
+            </w:r>
+          </w:p>
+        </w:tc>
+        <w:tc>
+          <w:tcPr/>
+          <w:p>
+            <w:pPr>
+              <w:pStyle w:val="Compact"/>
+            </w:pPr>
+          </w:p>
+        </w:tc>
+      </w:tr>
+      <w:tr>
+        <w:tc>
+          <w:tcPr/>
+          <w:p>
+            <w:pPr>
+              <w:pStyle w:val="Compact"/>
+            </w:pPr>
+            <w:r>
+              <w:t xml:space="preserve">additional_information</w:t>
+            </w:r>
+          </w:p>
+        </w:tc>
+        <w:tc>
+          <w:tcPr/>
+          <w:p>
+            <w:pPr>
+              <w:pStyle w:val="Compact"/>
+            </w:pPr>
+            <w:r>
+              <w:t xml:space="preserve">Free text field for extra information about the service providing group if needed.</w:t>
+            </w:r>
+          </w:p>
+        </w:tc>
+        <w:tc>
+          <w:tcPr/>
+          <w:p>
+            <w:pPr>
+              <w:pStyle w:val="Compact"/>
+            </w:pPr>
+            <w:r>
+              <w:t xml:space="preserve">text</w:t>
             </w:r>
           </w:p>
         </w:tc>
@@ -1702,16 +1745,16 @@
         <w:tblLook w:firstRow="1" w:lastRow="0" w:firstColumn="0" w:lastColumn="0" w:noHBand="0" w:noVBand="0" w:val="0020"/>
       </w:tblPr>
       <w:tblGrid>
-        <w:gridCol w:w="2598"/>
-        <w:gridCol w:w="742"/>
-        <w:gridCol w:w="618"/>
-        <w:gridCol w:w="495"/>
-        <w:gridCol w:w="495"/>
-        <w:gridCol w:w="742"/>
-        <w:gridCol w:w="495"/>
-        <w:gridCol w:w="618"/>
-        <w:gridCol w:w="495"/>
-        <w:gridCol w:w="618"/>
+        <w:gridCol w:w="2837"/>
+        <w:gridCol w:w="709"/>
+        <w:gridCol w:w="591"/>
+        <w:gridCol w:w="472"/>
+        <w:gridCol w:w="472"/>
+        <w:gridCol w:w="709"/>
+        <w:gridCol w:w="472"/>
+        <w:gridCol w:w="591"/>
+        <w:gridCol w:w="472"/>
+        <w:gridCol w:w="591"/>
       </w:tblGrid>
       <w:tr>
         <w:trPr>
@@ -2261,6 +2304,112 @@
             </w:pPr>
             <w:r>
               <w:t xml:space="preserve">status</w:t>
+            </w:r>
+          </w:p>
+        </w:tc>
+        <w:tc>
+          <w:tcPr/>
+          <w:p>
+            <w:pPr>
+              <w:pStyle w:val="Compact"/>
+            </w:pPr>
+          </w:p>
+        </w:tc>
+        <w:tc>
+          <w:tcPr/>
+          <w:p>
+            <w:pPr>
+              <w:pStyle w:val="Compact"/>
+            </w:pPr>
+            <w:r>
+              <w:t xml:space="preserve">R</w:t>
+            </w:r>
+          </w:p>
+        </w:tc>
+        <w:tc>
+          <w:tcPr/>
+          <w:p>
+            <w:pPr>
+              <w:pStyle w:val="Compact"/>
+            </w:pPr>
+            <w:r>
+              <w:t xml:space="preserve">R</w:t>
+            </w:r>
+          </w:p>
+        </w:tc>
+        <w:tc>
+          <w:tcPr/>
+          <w:p>
+            <w:pPr>
+              <w:pStyle w:val="Compact"/>
+            </w:pPr>
+            <w:r>
+              <w:t xml:space="preserve">R</w:t>
+            </w:r>
+          </w:p>
+        </w:tc>
+        <w:tc>
+          <w:tcPr/>
+          <w:p>
+            <w:pPr>
+              <w:pStyle w:val="Compact"/>
+            </w:pPr>
+            <w:r>
+              <w:t xml:space="preserve">RCU</w:t>
+            </w:r>
+          </w:p>
+        </w:tc>
+        <w:tc>
+          <w:tcPr/>
+          <w:p>
+            <w:pPr>
+              <w:pStyle w:val="Compact"/>
+            </w:pPr>
+            <w:r>
+              <w:t xml:space="preserve">R</w:t>
+            </w:r>
+          </w:p>
+        </w:tc>
+        <w:tc>
+          <w:tcPr/>
+          <w:p>
+            <w:pPr>
+              <w:pStyle w:val="Compact"/>
+            </w:pPr>
+            <w:r>
+              <w:t xml:space="preserve">RCU</w:t>
+            </w:r>
+          </w:p>
+        </w:tc>
+        <w:tc>
+          <w:tcPr/>
+          <w:p>
+            <w:pPr>
+              <w:pStyle w:val="Compact"/>
+            </w:pPr>
+            <w:r>
+              <w:t xml:space="preserve">R</w:t>
+            </w:r>
+          </w:p>
+        </w:tc>
+        <w:tc>
+          <w:tcPr/>
+          <w:p>
+            <w:pPr>
+              <w:pStyle w:val="Compact"/>
+            </w:pPr>
+          </w:p>
+        </w:tc>
+      </w:tr>
+      <w:tr>
+        <w:tc>
+          <w:tcPr/>
+          <w:p>
+            <w:pPr>
+              <w:pStyle w:val="Compact"/>
+            </w:pPr>
+            <w:r>
+              <w:t xml:space="preserve">additional_information</w:t>
             </w:r>
           </w:p>
         </w:tc>
@@ -2575,7 +2724,7 @@
     <w:bookmarkEnd w:id="46"/>
     <w:bookmarkEnd w:id="47"/>
     <w:sectPr>
-      <w:headerReference r:id="rId11" w:type="default"/>
+      <w:headerReference r:id="rId9" w:type="default"/>
       <w:pgSz w:h="11906" w:orient="landscape" w:w="16838"/>
       <w:pgMar w:bottom="1417" w:footer="708" w:gutter="0" w:header="708" w:left="1417" w:right="1417" w:top="1417"/>
       <w:cols w:space="708"/>

</xml_diff>